<commit_message>
Revert to DOCX-based PDF, remove summary CSV
</commit_message>
<xml_diff>
--- a/Al Zaid/Experianced.docx
+++ b/Al Zaid/Experianced.docx
@@ -5377,53 +5377,9 @@
                 <w:rFonts w:ascii="Calibri" w:hAnsi="Calibri" w:cs="Calibri"/>
                 <w:b/>
                 <w:bCs/>
-                <w:color w:val="FF0000"/>
-              </w:rPr>
-              <w:t xml:space="preserve">NO     </w:t>
-            </w:r>
-          </w:p>
-        </w:tc>
-        <w:tc>
-          <w:tcPr>
-            <w:tcW w:w="1590" w:type="dxa"/>
-            <w:tcBorders>
-              <w:top w:val="single" w:color="auto" w:sz="4" w:space="0"/>
-              <w:left w:val="single" w:color="auto" w:sz="4" w:space="0"/>
-              <w:bottom w:val="single" w:color="auto" w:sz="4" w:space="0"/>
-            </w:tcBorders>
-          </w:tcPr>
-          <w:p>
-            <w:pPr>
-              <w:spacing w:after="0" w:line="240" w:lineRule="auto"/>
-              <w:jc w:val="right"/>
-              <w:rPr>
-                <w:rFonts w:ascii="Calibri" w:hAnsi="Calibri" w:cs="Calibri"/>
-                <w:b/>
-                <w:bCs/>
-                <w:color w:val="FF0000"/>
-              </w:rPr>
-            </w:pPr>
-            <w:r>
-              <w:rPr>
-                <w:rFonts w:hint="cs" w:ascii="Calibri" w:hAnsi="Calibri" w:cs="Calibri"/>
-                <w:b/>
-                <w:bCs/>
-                <w:color w:val="FF0000"/>
-                <w:rtl/>
-                <w:cs/>
-              </w:rPr>
-              <w:t>ل</w:t>
-            </w:r>
-            <w:r>
-              <w:rPr>
-                <w:rFonts w:hint="cs" w:ascii="Calibri" w:hAnsi="Calibri" w:cs="Calibri"/>
-                <w:b/>
-                <w:bCs/>
-                <w:color w:val="000000"/>
-                <w:rtl/>
-                <w:cs/>
-              </w:rPr>
-              <w:t>ا</w:t>
+                <w:color w:val="000000"/>
+              </w:rPr>
+              <w:t>لا</w:t>
             </w:r>
             <w:r>
               <w:rPr>

</xml_diff>